<commit_message>
Walkthroughs for W6 & W8
</commit_message>
<xml_diff>
--- a/Workshops/Workshop 5 - LM with categorical predictors/W5.docx
+++ b/Workshops/Workshop 5 - LM with categorical predictors/W5.docx
@@ -95,7 +95,7 @@
         <w:t xml:space="preserve"> </w:t>
       </w:r>
       <w:r>
-        <w:t xml:space="preserve">2024-09-02</w:t>
+        <w:t xml:space="preserve">2024-09-03</w:t>
       </w:r>
     </w:p>
     <w:sdt>
@@ -667,7 +667,7 @@
               <m:e>
                 <m:phant>
                   <m:phantPr>
-                    <m:show m:val="off"/>
+                    <m:show m:val="0"/>
                   </m:phantPr>
                   <m:e>
                     <m:r>
@@ -1297,7 +1297,7 @@
           <m:e>
             <m:phant>
               <m:phantPr>
-                <m:show m:val="off"/>
+                <m:show m:val="0"/>
               </m:phantPr>
               <m:e>
                 <m:sSub>
@@ -1329,7 +1329,7 @@
           <m:e>
             <m:phant>
               <m:phantPr>
-                <m:show m:val="off"/>
+                <m:show m:val="0"/>
               </m:phantPr>
               <m:e>
                 <m:sSub>
@@ -1612,6 +1612,17 @@
     </w:p>
     <w:p>
       <w:pPr>
+        <w:pStyle w:val="SourceCode"/>
+      </w:pPr>
+      <w:r>
+        <w:rPr>
+          <w:rStyle w:val="VerbatimChar"/>
+        </w:rPr>
+        <w:t xml:space="preserve">## Warning: package 'ggeffects' was built under R version 4.3.3</w:t>
+      </w:r>
+    </w:p>
+    <w:p>
+      <w:pPr>
         <w:pStyle w:val="FirstParagraph"/>
       </w:pPr>
       <w:r>
@@ -1681,6 +1692,44 @@
           <w:rStyle w:val="NormalTok"/>
         </w:rPr>
         <w:t xml:space="preserve">(rabbit_mod)</w:t>
+      </w:r>
+    </w:p>
+    <w:p>
+      <w:pPr>
+        <w:pStyle w:val="SourceCode"/>
+      </w:pPr>
+      <w:r>
+        <w:rPr>
+          <w:rStyle w:val="VerbatimChar"/>
+        </w:rPr>
+        <w:t xml:space="preserve">## Warning: Some of the focal terms are of type `character`. This may lead to</w:t>
+      </w:r>
+      <w:r>
+        <w:br/>
+      </w:r>
+      <w:r>
+        <w:rPr>
+          <w:rStyle w:val="VerbatimChar"/>
+        </w:rPr>
+        <w:t xml:space="preserve">##   unexpected results. It is recommended to convert these variables to</w:t>
+      </w:r>
+      <w:r>
+        <w:br/>
+      </w:r>
+      <w:r>
+        <w:rPr>
+          <w:rStyle w:val="VerbatimChar"/>
+        </w:rPr>
+        <w:t xml:space="preserve">##   factors before fitting the model.</w:t>
+      </w:r>
+      <w:r>
+        <w:br/>
+      </w:r>
+      <w:r>
+        <w:rPr>
+          <w:rStyle w:val="VerbatimChar"/>
+        </w:rPr>
+        <w:t xml:space="preserve">##   The following variables in are of type character: `mongoose`</w:t>
       </w:r>
     </w:p>
     <w:p>
@@ -4540,7 +4589,6 @@
         <w:tblW w:type="pct" w:w="5000"/>
         <w:tblLook w:firstRow="1" w:lastRow="0" w:firstColumn="0" w:lastColumn="0" w:noHBand="0" w:noVBand="0" w:val="0020"/>
         <w:jc w:val="start"/>
-        <w:tblLayout w:type="fixed"/>
       </w:tblPr>
       <w:tblGrid>
         <w:gridCol w:w="856"/>

</xml_diff>